<commit_message>
fix(landing): remove AI Follow-up email mockup block per user request
</commit_message>
<xml_diff>
--- a/docs/Презентация_RevOps_Enterprise_OS_14_Слайдов.docx
+++ b/docs/Презентация_RevOps_Enterprise_OS_14_Слайдов.docx
@@ -26,23 +26,31 @@
           <w:rFonts w:ascii="Calibri" w:hAnsi="Calibri"/>
           <w:b/>
           <w:color w:val="0F172A"/>
-          <w:sz w:val="34"/>
+          <w:sz w:val="32"/>
         </w:rPr>
-        <w:t>Добро пожаловать в RevOps Enterprise OS!</w:t>
+        <w:t>Ликвидация утечек и возврат до 28% выручки отдела продаж</w:t>
       </w:r>
     </w:p>
     <w:p>
       <w:pPr>
-        <w:spacing w:after="200"/>
+        <w:spacing w:after="160"/>
       </w:pPr>
       <w:r>
         <w:rPr>
-          <w:sz w:val="22"/>
+          <w:rFonts w:ascii="Calibri" w:hAnsi="Calibri"/>
+          <w:color w:val="475569"/>
+          <w:sz w:val="20"/>
         </w:rPr>
-        <w:t>Интеллектуальная платформа сквозного контроля выручки, 100% речевого ИИ-аудита диалогов и оперативного управления отделом продаж для B2B-компаний.</w:t>
+        <w:t>Платформа 100% речевого ИИ-аудита диалогов, 15-минутного оперативного пульта РОПа и сквозного контроля сделок в amoCRM / Битрикс24.</w:t>
         <w:br/>
         <w:br/>
-        <w:t>Готовое промышленное решение для Собственников (CEO) и Руководителей отделов продаж (РОП).</w:t>
+        <w:t>• 100% аудит звонков нейросетью</w:t>
+        <w:br/>
+        <w:t>• 15 минут ежедневная планерка РОПа</w:t>
+        <w:br/>
+        <w:t>• &lt; 48 часов контроль зависания SLA</w:t>
+        <w:br/>
+        <w:t>• 152-ФЗ РФ Compliant</w:t>
       </w:r>
     </w:p>
     <w:p>
@@ -74,28 +82,33 @@
           <w:rFonts w:ascii="Calibri" w:hAnsi="Calibri"/>
           <w:b/>
           <w:color w:val="0F172A"/>
-          <w:sz w:val="34"/>
+          <w:sz w:val="32"/>
         </w:rPr>
         <w:t>Архитектура экосистемы RevOps Core</w:t>
       </w:r>
     </w:p>
     <w:p>
+      <w:pPr>
+        <w:spacing w:after="160"/>
+      </w:pPr>
       <w:r>
         <w:rPr>
+          <w:rFonts w:ascii="Calibri" w:hAnsi="Calibri"/>
+          <w:color w:val="475569"/>
           <w:sz w:val="20"/>
         </w:rPr>
-        <w:t>Единая технологическая среда для полной прозрачности коммерческого блока.</w:t>
+        <w:t>Единая технологическая среда для полной прозрачности коммерческого блока компании.</w:t>
         <w:br/>
         <w:br/>
-        <w:t>• RevOps Core Platform (SSOT) — центральное ядро, объединяющее звонки, сделки и финансы.</w:t>
+        <w:t>1. RevOps Core Platform (SSOT) — центральное вычислительное ядро и дашборд.</w:t>
         <w:br/>
-        <w:t>• AI Speech Inspector — транскрибация и оценка 100% звонков по 13 жестким стандартам.</w:t>
+        <w:t>2. AI Speech Inspector — транскрибация и оценка 100% звонков по 13 жестким критериям.</w:t>
         <w:br/>
-        <w:t>• amoCRM / B24 Reverse ETL — двусторонний обмен: запись саммари, тегов и задач за 15 секунд.</w:t>
+        <w:t>3. amoCRM / B24 Reverse ETL — двусторонний обмен: запись саммари, тегов и задач за 15 секунд.</w:t>
         <w:br/>
-        <w:t>• Пульт РОПа &amp; Воронка SLA — утренняя планерка за 15 минут, контроль зависших КП (&gt;48ч).</w:t>
+        <w:t>4. Пульт РОПа &amp; Воронка SLA — утренняя планерка за 15 минут, контроль зависших КП (&gt;48ч).</w:t>
         <w:br/>
-        <w:t>• Telegram War Room Bot — радар критических инцидентов и мгновенные алерты руководству.</w:t>
+        <w:t>5. Telegram War Room Bot — радар критических инцидентов и алерты за 15 минут при риске потери.</w:t>
       </w:r>
     </w:p>
     <w:p>
@@ -127,26 +140,28 @@
           <w:rFonts w:ascii="Calibri" w:hAnsi="Calibri"/>
           <w:b/>
           <w:color w:val="0F172A"/>
-          <w:sz w:val="34"/>
+          <w:sz w:val="32"/>
         </w:rPr>
         <w:t>Чем занимается RevOps Enterprise OS?</w:t>
       </w:r>
     </w:p>
     <w:p>
+      <w:pPr>
+        <w:spacing w:after="160"/>
+      </w:pPr>
       <w:r>
         <w:rPr>
+          <w:rFonts w:ascii="Calibri" w:hAnsi="Calibri"/>
+          <w:color w:val="475569"/>
           <w:sz w:val="20"/>
         </w:rPr>
-        <w:t>Три фундаментальные задачи платформы:</w:t>
+        <w:t>01. Оцифровывает и ликвидирует финансовые потери: устраняет 4 системные утечки (сливы звонков, зависшие КП, брошенные отказники, задержку оплат) и возвращает до 28% упущенной выручки.</w:t>
         <w:br/>
         <w:br/>
-        <w:t>1. Оцифровывает и ликвидирует финансовые потери: устраняет 4 утечки (сливы звонков, зависание КП, брошенные отказники, дебиторку) и возвращает до 28% выручки.</w:t>
+        <w:t>02. Слушает и объективно оценивает 100% звонков: освобождает РОПа от рутинного прослушивания сотен аудиозаписей, формирует Coaching Tips.</w:t>
         <w:br/>
         <w:br/>
-        <w:t>2. Слушает и объективно оценивает 100% звонков: освобождает РОПа от рутинного прослушивания сотен записей, дает готовые Coaching Tips.</w:t>
-        <w:br/>
-        <w:br/>
-        <w:t>3. Дает руководству управляемость и прогноз кассы: точный прогноз закрытия месяца (Run-Rate) и прозрачная динамическая мотивация (Payroll).</w:t>
+        <w:t>03. Дает руководству управляемость и прогноз кассы: точный прогноз закрытия месяца (Run-Rate) и прозрачная динамическая мотивация (Payroll).</w:t>
       </w:r>
     </w:p>
     <w:p>
@@ -178,32 +193,37 @@
           <w:rFonts w:ascii="Calibri" w:hAnsi="Calibri"/>
           <w:b/>
           <w:color w:val="0F172A"/>
-          <w:sz w:val="34"/>
+          <w:sz w:val="32"/>
         </w:rPr>
         <w:t>Почему обычная речевая аналитика не спасает продажи?</w:t>
       </w:r>
     </w:p>
     <w:p>
+      <w:pPr>
+        <w:spacing w:after="160"/>
+      </w:pPr>
       <w:r>
         <w:rPr>
+          <w:rFonts w:ascii="Calibri" w:hAnsi="Calibri"/>
+          <w:color w:val="475569"/>
           <w:sz w:val="20"/>
         </w:rPr>
-        <w:t>❌ ОБЫЧНАЯ РЕЧЕВАЯ АНАЛИТИКА ТЕЛЕФОНИИ:</w:t>
+        <w:t>❌ ПАССИВНАЯ ТРАНСКРИБАЦИЯ ТЕЛЕФОНИИ:</w:t>
         <w:br/>
-        <w:t>• Просто стенограмма текста: РОПу нужно читать часы диалогов.</w:t>
+        <w:t>• Просто полотно текста: РОПу нужно читать часы диалогов.</w:t>
         <w:br/>
         <w:t>• Облака тегов и слов-паразитов: не понимает, закрыта ли сделка.</w:t>
         <w:br/>
-        <w:t>• Оторвана от денег и воронки: не знает сумму сделки и стадию оплаты.</w:t>
+        <w:t>• Оторвана от воронки и денег: не знает сумму сделки и стадию оплаты.</w:t>
         <w:br/>
-        <w:t>• Нет связи с CRM: не ставит задачи и не меняет зарплату менеджера.</w:t>
+        <w:t>• Нет связи с CRM: не ставит задачи и не влияет на зарплату менеджера.</w:t>
         <w:br/>
         <w:br/>
-        <w:t>✅ БОЕВАЯ ПЛАТФОРМА REVOPS ENTERPRISE OS:</w:t>
+        <w:t>✅ БОЕВАЯ ОПЕРАЦИОННАЯ СИСТЕМА REVOPS ENTERPRISE OS:</w:t>
         <w:br/>
-        <w:t>• Оценка по 13 критериям продаж (ЛПР, бюджет, дедлайны, Next Step).</w:t>
+        <w:t>• 13 жестких стандартов продаж: проверяет ЛПР, бюджет, дедлайны и Next Step с датой и временем.</w:t>
         <w:br/>
-        <w:t>• Развернутое саммари в карточку сделки за 15 секунд после звонка.</w:t>
+        <w:t>• Развернутое саммари в CRM за 15 сек после звонка.</w:t>
         <w:br/>
         <w:t>• Автопостановка жестких задач Next Step при потере контакта.</w:t>
         <w:br/>
@@ -239,17 +259,22 @@
           <w:rFonts w:ascii="Calibri" w:hAnsi="Calibri"/>
           <w:b/>
           <w:color w:val="0F172A"/>
-          <w:sz w:val="34"/>
+          <w:sz w:val="32"/>
         </w:rPr>
         <w:t>Кто наши клиенты и какие задачи мы решаем?</w:t>
       </w:r>
     </w:p>
     <w:p>
+      <w:pPr>
+        <w:spacing w:after="160"/>
+      </w:pPr>
       <w:r>
         <w:rPr>
-          <w:sz w:val="19"/>
+          <w:rFonts w:ascii="Calibri" w:hAnsi="Calibri"/>
+          <w:color w:val="475569"/>
+          <w:sz w:val="20"/>
         </w:rPr>
-        <w:t>👑 ЗАДАЧИ СОБСТВЕННИКОВ (CEO):</w:t>
+        <w:t>👑 СОБСТВЕННИКИ И CEO:</w:t>
         <w:br/>
         <w:t>1. Прекращаем слив рекламного бюджета на неквалифицированных звонках.</w:t>
         <w:br/>
@@ -257,24 +282,24 @@
         <w:br/>
         <w:t>3. Оцифровываем скрытые финансовые потери коммерческого блока в рублях.</w:t>
         <w:br/>
-        <w:t>4. Исключаем зависимость от токсичных «звезд».</w:t>
+        <w:t>4. Исключаем зависимость от «незаменимых» и токсичных менеджеров-звезд.</w:t>
         <w:br/>
         <w:t>5. Внедряем честный расчет бонусов за соблюдение регламентов.</w:t>
         <w:br/>
         <w:t>6. Защищаем компанию от кассовых разрывов через контроль дебиторки (DSO).</w:t>
         <w:br/>
         <w:br/>
-        <w:t>📋 ЗАДАЧИ РУКОВОДИТЕЛЕЙ ПРОДАЖ (РОП):</w:t>
+        <w:t>📋 РУКОВОДИТЕЛИ ОТДЕЛОВ ПРОДАЖ (РОП):</w:t>
         <w:br/>
-        <w:t>1. Сокращаем планерку с 1.5 часов до 15 минут строго по фактам.</w:t>
+        <w:t>1. Сокращаем утреннюю планерку с 1.5 часов до 15 минут строго по фактам.</w:t>
         <w:br/>
-        <w:t>2. Экономим 3 часа в день на прослушивании аудиозаписей.</w:t>
+        <w:t>2. Экономим до 3 часов в день на прослушивании аудиозаписей.</w:t>
         <w:br/>
         <w:t>3. Мгновенно узнаем о срыве крупных сделок и успеваем спасти клиента за 15 минут.</w:t>
         <w:br/>
         <w:t>4. Гарантируем 100% контроль даты и времени следующего контакта (Next Step).</w:t>
         <w:br/>
-        <w:t>5. Получаем готовые подсказки Coaching Tips для прокачки менеджеров.</w:t>
+        <w:t>5. Получаем готовые Coaching Tips для прокачки менеджеров.</w:t>
         <w:br/>
         <w:t>6. Устраняем рутину ручного контроля карточек в amoCRM.</w:t>
       </w:r>
@@ -308,21 +333,26 @@
           <w:rFonts w:ascii="Calibri" w:hAnsi="Calibri"/>
           <w:b/>
           <w:color w:val="0F172A"/>
-          <w:sz w:val="34"/>
+          <w:sz w:val="32"/>
         </w:rPr>
         <w:t>Как это работает: Модуль 1. Речевой ИИ-Аудит Звонков</w:t>
       </w:r>
     </w:p>
     <w:p>
+      <w:pPr>
+        <w:spacing w:after="160"/>
+      </w:pPr>
       <w:r>
         <w:rPr>
+          <w:rFonts w:ascii="Calibri" w:hAnsi="Calibri"/>
+          <w:color w:val="475569"/>
           <w:sz w:val="20"/>
         </w:rPr>
-        <w:t>• Шаг 1. Бесшовный захват аудио: перехват из Манго, Телфина, Sipuni, Моих Звонков без участия людей.</w:t>
+        <w:t>• Шаг 1. Бесшовный захват аудио: перехват из Манго, Телфина, Sipuni, Моих Звонков без участия людей (100% охват).</w:t>
         <w:br/>
         <w:t>• Шаг 2. Скоринг по 13 критериям: проверка ЛПР, потребностей, бюджета, дедлайнов и фиксации даты следующего шага.</w:t>
         <w:br/>
-        <w:t>• Шаг 3. Формирование Coaching Tip: балл 0-100, выделение ошибок и готовая фраза-подсказка.</w:t>
+        <w:t>• Шаг 3. Coaching Tip и балл 0–100: выделение ошибок, оценка зоны риска и готовая фраза-подсказка РОПа.</w:t>
       </w:r>
     </w:p>
     <w:p>
@@ -354,21 +384,26 @@
           <w:rFonts w:ascii="Calibri" w:hAnsi="Calibri"/>
           <w:b/>
           <w:color w:val="0F172A"/>
-          <w:sz w:val="34"/>
+          <w:sz w:val="32"/>
         </w:rPr>
         <w:t>Как это работает: Модуль 2. Двусторонняя Автоматизация amoCRM</w:t>
       </w:r>
     </w:p>
     <w:p>
+      <w:pPr>
+        <w:spacing w:after="160"/>
+      </w:pPr>
       <w:r>
         <w:rPr>
+          <w:rFonts w:ascii="Calibri" w:hAnsi="Calibri"/>
+          <w:color w:val="475569"/>
           <w:sz w:val="20"/>
         </w:rPr>
-        <w:t>• Шаг 1. Развернутое саммари в сделку за 15 секунд + заполнение числового поля «Оценка ИИ (0–100)».</w:t>
+        <w:t>• Шаг 1. Саммари в сделку (15 сек): структурированное примечание, суть договоренностей, поле «Оценка ИИ (0–100)».</w:t>
         <w:br/>
-        <w:t>• Шаг 2. Автопостановка задач Next Step при потере контакта или по обещанию клиенту к точному времени.</w:t>
+        <w:t>• Шаг 2. Автопостановка Next Step: жесткая задача при потере контакта или к точному времени по обещанию клиенту.</w:t>
         <w:br/>
-        <w:t>• Шаг 3. Умное тегирование (#Брак_Речи, #Возражение_Дорого) и генерация Follow-Up текста для WhatsApp.</w:t>
+        <w:t>• Шаг 3. Умные теги &amp; Follow-Up: маркировка #Брак_Речи, генерация текста для отправки в WhatsApp в 1 клик.</w:t>
       </w:r>
     </w:p>
     <w:p>
@@ -400,21 +435,26 @@
           <w:rFonts w:ascii="Calibri" w:hAnsi="Calibri"/>
           <w:b/>
           <w:color w:val="0F172A"/>
-          <w:sz w:val="34"/>
+          <w:sz w:val="32"/>
         </w:rPr>
-        <w:t>Как это работает: Модуль 3. Операционный Пульт РОПа и Безопасность</w:t>
+        <w:t>Как это работает: Модуль 3. Операционный Пульт и Безопасность</w:t>
       </w:r>
     </w:p>
     <w:p>
+      <w:pPr>
+        <w:spacing w:after="160"/>
+      </w:pPr>
       <w:r>
         <w:rPr>
+          <w:rFonts w:ascii="Calibri" w:hAnsi="Calibri"/>
+          <w:color w:val="475569"/>
           <w:sz w:val="20"/>
         </w:rPr>
-        <w:t>• 1. 15-минутный Пульт РОПа: темп месяца (Pacing), воронка AS-IS, ТОП-5 критических рисков выручки.</w:t>
+        <w:t>• 1. Пульт РОПа (15 минут): Pacing график плана, выявление зависших сделок на этапе КП (&gt;48ч), ТОП-5 критических рисков.</w:t>
         <w:br/>
-        <w:t>• 2. Telegram War Room: красная тревога РОПу за 15 минут при срыве сделки &gt;300 000 ₽.</w:t>
+        <w:t>• 2. Telegram War Room: алерт РОПу за 15 минут при срыве сделки &gt;300 000 ₽, утренняя сводка в 09:00, вечерний отчет в 19:00.</w:t>
         <w:br/>
-        <w:t>• 3. Безопасность и 152-ФЗ РФ: сервера в РФ, изоляция данных по Tenant UUID, закрытый AI Black Box.</w:t>
+        <w:t>• 3. Безопасность и 152-ФЗ РФ: сервера в РФ, изоляция данных по Tenant UUID, закрытый контур промптов.</w:t>
       </w:r>
     </w:p>
     <w:p>
@@ -446,23 +486,28 @@
           <w:rFonts w:ascii="Calibri" w:hAnsi="Calibri"/>
           <w:b/>
           <w:color w:val="0F172A"/>
-          <w:sz w:val="34"/>
+          <w:sz w:val="32"/>
         </w:rPr>
         <w:t>Внедрение без саботажа и увольнений сотрудников</w:t>
       </w:r>
     </w:p>
     <w:p>
+      <w:pPr>
+        <w:spacing w:after="160"/>
+      </w:pPr>
       <w:r>
         <w:rPr>
+          <w:rFonts w:ascii="Calibri" w:hAnsi="Calibri"/>
+          <w:color w:val="475569"/>
           <w:sz w:val="20"/>
         </w:rPr>
-        <w:t>1. Личный тренер, а не надзиратель: ошибки и советы приходят менеджеру тет-а-тет в личку, без публичного позора. РОП становится наставником.</w:t>
+        <w:t>1. Личный тренер, а не надзиратель: ошибки приходят менеджеру в личку сразу после звонка, без публичного позора. РОП становится ментором команды.</w:t>
         <w:br/>
         <w:br/>
-        <w:t>2. Снятие 80% рутины: система сама пишет саммари, ставит напоминания и генерирует текст для WhatsApp. Менеджеры освобождают 1.5 часа в день на продажи.</w:t>
+        <w:t>2. Снятие 80% рутины: система сама пишет саммари, ставит задачи и формирует текст для WhatsApp. Менеджеры освобождают 1.5 часа в день на продажи.</w:t>
         <w:br/>
         <w:br/>
-        <w:t>3. Прозрачные деньги и справедливые бонусы: премия считается строго по формуле. Кто продает по правилам — зарабатывает больше всех. Исключается текучка кадров.</w:t>
+        <w:t>3. Честные и прозрачные бонусы: премия считается строго по формуле. Кто продает по правилам — зарабатывает больше всех. Устраняется текучка кадров.</w:t>
       </w:r>
     </w:p>
     <w:p>
@@ -494,25 +539,30 @@
           <w:rFonts w:ascii="Calibri" w:hAnsi="Calibri"/>
           <w:b/>
           <w:color w:val="0F172A"/>
-          <w:sz w:val="34"/>
+          <w:sz w:val="32"/>
         </w:rPr>
         <w:t>Дорожная карта пилота: от 0 до найденных денег за 7 дней</w:t>
       </w:r>
     </w:p>
     <w:p>
+      <w:pPr>
+        <w:spacing w:after="160"/>
+      </w:pPr>
       <w:r>
         <w:rPr>
+          <w:rFonts w:ascii="Calibri" w:hAnsi="Calibri"/>
+          <w:color w:val="475569"/>
           <w:sz w:val="20"/>
         </w:rPr>
-        <w:t>• День 1 (15 минут): Подключение amoCRM / телефонии, запуск защищенного вебхука.</w:t>
+        <w:t>• День 1 (15 минут): Подключение CRM и телефонии через защищенный вебхук.</w:t>
         <w:br/>
         <w:t>• Дни 2–3 (24 часа): Захват первых 100 звонков, калибровка 13 стандартов под B2B-нишу.</w:t>
         <w:br/>
         <w:t>• Дни 4–5 (Контроль): Активация автопостановки задач Next Step и умных тегов в сделках.</w:t>
         <w:br/>
-        <w:t>• День 6 (Операционка): Первая планерка по Пульту РОПа, разбор ТОП-5 рисковых зависших сделок.</w:t>
+        <w:t>• День 6 (Планерка): Первая планерка по Пульту РОПа, разбор ТОП-5 рисковых зависших сделок.</w:t>
         <w:br/>
-        <w:t>• День 7 (Деньги): Финансовый отчет Собственнику, объем предотвращенных потерь, окупаемость пилота 3x–5x.</w:t>
+        <w:t>• День 7 (Деньги): Финансовый отчет Собственнику, объем предотвращенных потерь, окупаемость 3x–5x.</w:t>
       </w:r>
     </w:p>
     <w:p>
@@ -544,31 +594,40 @@
           <w:rFonts w:ascii="Calibri" w:hAnsi="Calibri"/>
           <w:b/>
           <w:color w:val="0F172A"/>
-          <w:sz w:val="34"/>
+          <w:sz w:val="32"/>
         </w:rPr>
         <w:t>Платформа RevOps OS в цифрах</w:t>
       </w:r>
     </w:p>
     <w:p>
+      <w:pPr>
+        <w:spacing w:after="160"/>
+      </w:pPr>
       <w:r>
         <w:rPr>
+          <w:rFonts w:ascii="Calibri" w:hAnsi="Calibri"/>
+          <w:color w:val="475569"/>
           <w:sz w:val="20"/>
         </w:rPr>
+        <w:t>ЭКСТРЕМАЛЬНЫЙ КОНТРАСТ В МЕТРИКАХ:</w:t>
+        <w:br/>
+        <w:br/>
+        <w:t>🚀 +18–34% — Прирост чистой выручки в первые 60 дней за счет ликвидации потерь на этапе КП и звонков</w:t>
+        <w:br/>
+        <w:t>⏱️ 15 МИНУТ — Длительность ежедневной планерки РОПа строго по фактам и цифрам вместо 1.5 часов хаоса</w:t>
+        <w:br/>
+        <w:br/>
         <w:t>• 100% звонков аудируются ИИ без участия человека</w:t>
         <w:br/>
-        <w:t>• 15 минут — длительность ежедневной планерки РОПа по фактам</w:t>
+        <w:t>• &lt; 48 часов — норматив на этапе КП под контролем SLA</w:t>
         <w:br/>
-        <w:t>• +18–34% средний рост чистой выручки в первые 60 дней</w:t>
+        <w:t>• 13 стандартов эталонных продаж в матрице</w:t>
         <w:br/>
-        <w:t>• &lt; 48 часов — норматив нахождения сделки на этапе КП под контролем SLA</w:t>
+        <w:t>• 118 автоматических тестов математики QA Suite</w:t>
         <w:br/>
-        <w:t>• 13 стандартов в эталонной речевой матрице</w:t>
+        <w:t>• 4 системные утечки воронки ликвидируются под ключ</w:t>
         <w:br/>
-        <w:t>• 118 автоматических тестов математики в QA Suite</w:t>
-        <w:br/>
-        <w:t>• 4 финансовые утечки ликвидируются под ключ</w:t>
-        <w:br/>
-        <w:t>• 15 минут — техническое время развертывания нового клиента</w:t>
+        <w:t>• 15 минут — техническое время подключения нового клиента</w:t>
       </w:r>
     </w:p>
     <w:p>
@@ -600,14 +659,19 @@
           <w:rFonts w:ascii="Calibri" w:hAnsi="Calibri"/>
           <w:b/>
           <w:color w:val="0F172A"/>
-          <w:sz w:val="34"/>
+          <w:sz w:val="32"/>
         </w:rPr>
-        <w:t>Ключевые факты о RevOps Enterprise OS</w:t>
+        <w:t>Факты о RevOps Enterprise OS</w:t>
       </w:r>
     </w:p>
     <w:p>
+      <w:pPr>
+        <w:spacing w:after="160"/>
+      </w:pPr>
       <w:r>
         <w:rPr>
+          <w:rFonts w:ascii="Calibri" w:hAnsi="Calibri"/>
+          <w:color w:val="475569"/>
           <w:sz w:val="20"/>
         </w:rPr>
         <w:t>✓ Единый контур SSOT (речевой аудит + CRM + Пульт РОПа в одном месте).</w:t>
@@ -656,14 +720,19 @@
           <w:rFonts w:ascii="Calibri" w:hAnsi="Calibri"/>
           <w:b/>
           <w:color w:val="0F172A"/>
-          <w:sz w:val="34"/>
+          <w:sz w:val="32"/>
         </w:rPr>
         <w:t>Почему мы достигаем таких результатов? Наши принципы</w:t>
       </w:r>
     </w:p>
     <w:p>
+      <w:pPr>
+        <w:spacing w:after="160"/>
+      </w:pPr>
       <w:r>
         <w:rPr>
+          <w:rFonts w:ascii="Calibri" w:hAnsi="Calibri"/>
+          <w:color w:val="475569"/>
           <w:sz w:val="20"/>
         </w:rPr>
         <w:t>1. Цифры и факты вместо субъективных отчетов: исключаем отговорки «клиент думает» — опираемся на стенограмму, таймкоды и зафиксированные дедлайны.</w:t>
@@ -704,37 +773,42 @@
           <w:rFonts w:ascii="Calibri" w:hAnsi="Calibri"/>
           <w:b/>
           <w:color w:val="0F172A"/>
-          <w:sz w:val="34"/>
+          <w:sz w:val="32"/>
         </w:rPr>
-        <w:t>Контакты и Бесплатный Тест-Драйв: Аудит 3 Звонков = 0 ₽</w:t>
+        <w:t>Входной Тест-Драйв: Экспресс-Аудит 3 Звонков = 0 Рублей</w:t>
       </w:r>
     </w:p>
     <w:p>
+      <w:pPr>
+        <w:spacing w:after="160"/>
+      </w:pPr>
       <w:r>
         <w:rPr>
-          <w:sz w:val="21"/>
+          <w:rFonts w:ascii="Calibri" w:hAnsi="Calibri"/>
+          <w:color w:val="475569"/>
+          <w:sz w:val="20"/>
         </w:rPr>
+        <w:t>🎁 ГЛАВНЫЙ ОФФЕР: ЭКСПРЕСС-АУДИТ 3 ЗВОНКОВ = 0 РУБЛЕЙ</w:t>
+        <w:br/>
+        <w:t>Загрузите 3 аудиозаписи вашей команды в бота прямо сейчас — получите отчет по 13 критериям за 2 минуты бесплатно!</w:t>
+        <w:br/>
+        <w:br/>
+        <w:t>👉 Запустить бесплатный аудит в Telegram: @RevOps_Super_Audit_Bot (https://t.me/RevOps_Super_Audit_Bot?start=audit3)</w:t>
+        <w:br/>
+        <w:t>👉 MAX Бот (Экспресс-аудит): https://max.ru/se14526668_bot</w:t>
+        <w:br/>
+        <w:br/>
         <w:t>👤 ДМИТРИЙ ФЕДОТОВ — Основатель ai-rop.ru (B2B Sales &amp; RevOps)</w:t>
         <w:br/>
         <w:t>«Лично курирую каждый пилотный проект и отвечаю на вопросы по интеграции».</w:t>
         <w:br/>
+        <w:t>• Личный Telegram: @dm1918 (https://t.me/dm1918)</w:t>
         <w:br/>
-        <w:t>• Telegram: @dm1918 (https://t.me/dm1918)</w:t>
+        <w:t>• Личный MAX Профиль: https://max.ru/u/f9LHodD0cOLRcNKRakz94FpZjmUJ25lYzJUMzPBJyLKwxM1Tzzai1aF-dTg</w:t>
         <w:br/>
-        <w:t>• MAX Профиль: https://max.ru/u/f9LHodD0cOLRcNKRakz94FpZjmUJ25lYzJUMzPBJyLKwxM1Tzzai1aF-dTg</w:t>
+        <w:t>• Email: info@ai-rop.ru (Официальная почта для юрлиц и КП)</w:t>
         <w:br/>
-        <w:t>• MAX Бот (Экспресс-аудит): https://max.ru/se14526668_bot</w:t>
-        <w:br/>
-        <w:t>• Telegram Бот (Скоринг звонков): https://t.me/RevOps_Super_Audit_Bot?start=audit3</w:t>
-        <w:br/>
-        <w:t>• Официальная почта для юрлиц и КП: info@ai-rop.ru</w:t>
-        <w:br/>
-        <w:t>• Официальный сайт: https://ai-rop.ru</w:t>
-        <w:br/>
-        <w:br/>
-        <w:t>🎁 СПЕЦИАЛЬНЫЙ ВХОДНОЙ ОФФЕР: ЭКСПРЕСС-АУДИТ 3 ЗВОНКОВ = 0 РУБЛЕЙ</w:t>
-        <w:br/>
-        <w:t>Загрузите 3 аудиозаписи вашей команды в бота (Telegram или MAX) прямо сейчас — и получите глубокий аудит по 13 критериям за 2 минуты абсолютно бесплатно!</w:t>
+        <w:t>• Сайт: https://ai-rop.ru</w:t>
       </w:r>
     </w:p>
     <w:sectPr>

</xml_diff>